<commit_message>
semana 2 ejercicio 3 react hooks
</commit_message>
<xml_diff>
--- a/semana09/react installation.docx
+++ b/semana09/react installation.docx
@@ -4,6 +4,9 @@
   <w:body>
     <w:p>
       <w:r>
+        <w:rPr>
+          <w:noProof/>
+        </w:rPr>
         <w:drawing>
           <wp:inline distT="0" distB="0" distL="0" distR="0" wp14:anchorId="77A5EEA0" wp14:editId="0F24BB88">
             <wp:extent cx="5612130" cy="4622165"/>
@@ -44,6 +47,9 @@
     <w:p/>
     <w:p>
       <w:r>
+        <w:rPr>
+          <w:noProof/>
+        </w:rPr>
         <w:lastRenderedPageBreak/>
         <w:drawing>
           <wp:inline distT="0" distB="0" distL="0" distR="0" wp14:anchorId="0FD2848C" wp14:editId="0303EF8F">
@@ -85,6 +91,9 @@
     <w:p/>
     <w:p>
       <w:r>
+        <w:rPr>
+          <w:noProof/>
+        </w:rPr>
         <w:lastRenderedPageBreak/>
         <w:drawing>
           <wp:inline distT="0" distB="0" distL="0" distR="0" wp14:anchorId="65B5FE46" wp14:editId="47156DDB">
@@ -125,6 +134,9 @@
     </w:p>
     <w:p>
       <w:r>
+        <w:rPr>
+          <w:noProof/>
+        </w:rPr>
         <w:lastRenderedPageBreak/>
         <w:drawing>
           <wp:inline distT="0" distB="0" distL="0" distR="0" wp14:anchorId="7BD31B87" wp14:editId="794CC9A8">
@@ -151,6 +163,57 @@
                     <a:xfrm>
                       <a:off x="0" y="0"/>
                       <a:ext cx="5612130" cy="4135755"/>
+                    </a:xfrm>
+                    <a:prstGeom prst="rect">
+                      <a:avLst/>
+                    </a:prstGeom>
+                  </pic:spPr>
+                </pic:pic>
+              </a:graphicData>
+            </a:graphic>
+          </wp:inline>
+        </w:drawing>
+      </w:r>
+    </w:p>
+    <w:p/>
+    <w:p>
+      <w:r>
+        <w:br w:type="page"/>
+      </w:r>
+    </w:p>
+    <w:p>
+      <w:r>
+        <w:lastRenderedPageBreak/>
+        <w:t>Instalación proyecto REACT.</w:t>
+      </w:r>
+    </w:p>
+    <w:p>
+      <w:r>
+        <w:drawing>
+          <wp:inline distT="0" distB="0" distL="0" distR="0" wp14:anchorId="574C0E2E" wp14:editId="7DFDC7FE">
+            <wp:extent cx="5612130" cy="3663950"/>
+            <wp:effectExtent l="0" t="0" r="7620" b="0"/>
+            <wp:docPr id="5" name="Imagen 5"/>
+            <wp:cNvGraphicFramePr>
+              <a:graphicFrameLocks xmlns:a="http://schemas.openxmlformats.org/drawingml/2006/main" noChangeAspect="1"/>
+            </wp:cNvGraphicFramePr>
+            <a:graphic xmlns:a="http://schemas.openxmlformats.org/drawingml/2006/main">
+              <a:graphicData uri="http://schemas.openxmlformats.org/drawingml/2006/picture">
+                <pic:pic xmlns:pic="http://schemas.openxmlformats.org/drawingml/2006/picture">
+                  <pic:nvPicPr>
+                    <pic:cNvPr id="1" name=""/>
+                    <pic:cNvPicPr/>
+                  </pic:nvPicPr>
+                  <pic:blipFill>
+                    <a:blip r:embed="rId8"/>
+                    <a:stretch>
+                      <a:fillRect/>
+                    </a:stretch>
+                  </pic:blipFill>
+                  <pic:spPr>
+                    <a:xfrm>
+                      <a:off x="0" y="0"/>
+                      <a:ext cx="5612130" cy="3663950"/>
                     </a:xfrm>
                     <a:prstGeom prst="rect">
                       <a:avLst/>

</xml_diff>